<commit_message>
Laboratorio 7 Entrega final
</commit_message>
<xml_diff>
--- a/Docs/Observaciones-Lab7.docx
+++ b/Docs/Observaciones-Lab7.docx
@@ -9,7 +9,6 @@
         <w:rPr>
           <w:b/>
           <w:bCs/>
-          <w:noProof w:val="0"/>
           <w:lang w:val="es-CO"/>
         </w:rPr>
       </w:pPr>
@@ -17,7 +16,6 @@
         <w:rPr>
           <w:b/>
           <w:bCs/>
-          <w:noProof w:val="0"/>
           <w:lang w:val="es-CO"/>
         </w:rPr>
         <w:t>OBSERVACIONES DE LA PR</w:t>
@@ -26,7 +24,6 @@
         <w:rPr>
           <w:b/>
           <w:bCs/>
-          <w:noProof w:val="0"/>
           <w:lang w:val="es-CO"/>
         </w:rPr>
         <w:t>Á</w:t>
@@ -35,7 +32,6 @@
         <w:rPr>
           <w:b/>
           <w:bCs/>
-          <w:noProof w:val="0"/>
           <w:lang w:val="es-CO"/>
         </w:rPr>
         <w:t>CTICA</w:t>
@@ -43,107 +39,71 @@
     </w:p>
     <w:p>
       <w:pPr>
-        <w:spacing w:after="0"/>
+        <w:pStyle w:val="Ttulo1"/>
         <w:jc w:val="right"/>
         <w:rPr>
-          <w:noProof w:val="0"/>
-          <w:lang w:val="es-CO"/>
-        </w:rPr>
-      </w:pPr>
-      <w:r>
-        <w:rPr>
-          <w:noProof w:val="0"/>
-          <w:lang w:val="es-CO"/>
-        </w:rPr>
-        <w:t xml:space="preserve">Estudiante </w:t>
-      </w:r>
-      <w:r>
-        <w:rPr>
-          <w:noProof w:val="0"/>
-          <w:lang w:val="es-CO"/>
-        </w:rPr>
-        <w:t>1 Cod XXXX</w:t>
+          <w:rFonts w:ascii="Times New Roman" w:hAnsi="Times New Roman" w:cs="Times New Roman"/>
+          <w:color w:val="auto"/>
+          <w:sz w:val="22"/>
+          <w:szCs w:val="22"/>
+          <w:lang w:val="es-CO"/>
+        </w:rPr>
+      </w:pPr>
+      <w:r>
+        <w:rPr>
+          <w:rFonts w:ascii="Times New Roman" w:hAnsi="Times New Roman" w:cs="Times New Roman"/>
+          <w:color w:val="auto"/>
+          <w:sz w:val="22"/>
+          <w:szCs w:val="22"/>
+          <w:lang w:val="es-CO"/>
+        </w:rPr>
+        <w:t>1. Larry Thomas Sanchez, lt.sanchezb1@uniandes.edu.co, 202615358</w:t>
       </w:r>
     </w:p>
     <w:p>
       <w:pPr>
-        <w:spacing w:after="0"/>
+        <w:pStyle w:val="Ttulo1"/>
         <w:jc w:val="right"/>
         <w:rPr>
-          <w:noProof w:val="0"/>
-          <w:lang w:val="es-CO"/>
-        </w:rPr>
-      </w:pPr>
-      <w:r>
-        <w:rPr>
-          <w:noProof w:val="0"/>
-          <w:lang w:val="es-CO"/>
-        </w:rPr>
-        <w:t xml:space="preserve">Estudiante </w:t>
-      </w:r>
-      <w:r>
-        <w:rPr>
-          <w:noProof w:val="0"/>
-          <w:lang w:val="es-CO"/>
-        </w:rPr>
-        <w:t>2 Cod XXXX</w:t>
+          <w:rFonts w:ascii="Times New Roman" w:hAnsi="Times New Roman" w:cs="Times New Roman"/>
+          <w:color w:val="auto"/>
+          <w:sz w:val="22"/>
+          <w:szCs w:val="22"/>
+          <w:lang w:val="es-CO"/>
+        </w:rPr>
+      </w:pPr>
+      <w:r>
+        <w:rPr>
+          <w:rFonts w:ascii="Times New Roman" w:hAnsi="Times New Roman" w:cs="Times New Roman"/>
+          <w:color w:val="auto"/>
+          <w:sz w:val="22"/>
+          <w:szCs w:val="22"/>
+          <w:lang w:val="es-CO"/>
+        </w:rPr>
+        <w:t>2. Jorge Claros, j.claross2@uniandes.edu.co, 202522281</w:t>
       </w:r>
     </w:p>
     <w:p>
       <w:pPr>
-        <w:spacing w:after="0"/>
-        <w:jc w:val="right"/>
-        <w:rPr>
-          <w:noProof w:val="0"/>
-          <w:lang w:val="es-CO"/>
-        </w:rPr>
-      </w:pPr>
-      <w:r>
-        <w:rPr>
-          <w:noProof w:val="0"/>
-          <w:lang w:val="es-CO"/>
-        </w:rPr>
-        <w:t xml:space="preserve">Estudiante </w:t>
-      </w:r>
-      <w:r>
-        <w:rPr>
-          <w:noProof w:val="0"/>
-          <w:lang w:val="es-CO"/>
-        </w:rPr>
-        <w:t>3</w:t>
-      </w:r>
-      <w:r>
-        <w:rPr>
-          <w:noProof w:val="0"/>
-          <w:lang w:val="es-CO"/>
-        </w:rPr>
-        <w:t xml:space="preserve"> Cod XXXX</w:t>
+        <w:pStyle w:val="Ttulo1"/>
+        <w:rPr>
+          <w:b/>
+          <w:bCs/>
+          <w:lang w:val="es-CO"/>
+        </w:rPr>
+      </w:pPr>
+      <w:r>
+        <w:rPr>
+          <w:b/>
+          <w:bCs/>
+          <w:lang w:val="es-CO"/>
+        </w:rPr>
+        <w:t>Preguntas de análisis</w:t>
       </w:r>
     </w:p>
     <w:p>
       <w:pPr>
-        <w:pStyle w:val="Ttulo1"/>
-        <w:rPr>
-          <w:b/>
-          <w:bCs/>
-          <w:noProof w:val="0"/>
-          <w:lang w:val="es-CO"/>
-        </w:rPr>
-      </w:pPr>
-      <w:r>
-        <w:rPr>
-          <w:b/>
-          <w:bCs/>
-          <w:noProof w:val="0"/>
-          <w:lang w:val="es-CO"/>
-        </w:rPr>
-        <w:t>Preguntas de análisis</w:t>
-      </w:r>
-    </w:p>
-    <w:p>
-      <w:pPr>
-        <w:rPr>
-          <w:noProof w:val="0"/>
+        <w:rPr>
           <w:lang w:val="es-CO"/>
         </w:rPr>
       </w:pPr>
@@ -158,17 +118,208 @@
         <w:spacing w:after="0"/>
         <w:jc w:val="both"/>
         <w:rPr>
-          <w:rFonts w:ascii="Dax-Regular" w:hAnsi="Dax-Regular"/>
-          <w:lang w:val="es-CO"/>
-        </w:rPr>
-      </w:pPr>
-      <w:r>
-        <w:rPr>
-          <w:rFonts w:ascii="Dax-Regular" w:hAnsi="Dax-Regular"/>
+          <w:rFonts w:ascii="Times New Roman" w:hAnsi="Times New Roman" w:cs="Times New Roman"/>
+          <w:b/>
+          <w:bCs/>
+          <w:lang w:val="es-CO"/>
+        </w:rPr>
+      </w:pPr>
+      <w:r>
+        <w:rPr>
+          <w:rFonts w:ascii="Times New Roman" w:hAnsi="Times New Roman" w:cs="Times New Roman"/>
+          <w:b/>
+          <w:bCs/>
           <w:lang w:val="es-CO"/>
         </w:rPr>
         <w:t>¿Qué relación encuentra entre el número de elementos en el árbol y la altura del árbol?</w:t>
       </w:r>
+    </w:p>
+    <w:p>
+      <w:pPr>
+        <w:pStyle w:val="Prrafodelista"/>
+        <w:spacing w:after="0"/>
+        <w:ind w:left="360"/>
+        <w:jc w:val="both"/>
+        <w:rPr>
+          <w:rFonts w:ascii="Times New Roman" w:hAnsi="Times New Roman" w:cs="Times New Roman"/>
+          <w:b/>
+          <w:bCs/>
+          <w:lang w:val="es-CO"/>
+        </w:rPr>
+      </w:pPr>
+    </w:p>
+    <w:p>
+      <w:pPr>
+        <w:spacing w:after="0"/>
+        <w:rPr>
+          <w:rFonts w:ascii="Times New Roman" w:hAnsi="Times New Roman" w:cs="Times New Roman"/>
+          <w:lang w:val="es-CO"/>
+        </w:rPr>
+      </w:pPr>
+      <w:r>
+        <w:rPr>
+          <w:rFonts w:ascii="Times New Roman" w:hAnsi="Times New Roman" w:cs="Times New Roman"/>
+          <w:lang w:val="es-CO"/>
+        </w:rPr>
+        <w:t>En nuestro árbol hay 1177 elementos y la altura es 29. Si el árbol estuviera perfectamente balanceado la altura sería más o menos log</w:t>
+      </w:r>
+      <w:proofErr w:type="gramStart"/>
+      <w:r>
+        <w:rPr>
+          <w:rFonts w:ascii="Times New Roman" w:hAnsi="Times New Roman" w:cs="Times New Roman"/>
+          <w:lang w:val="es-CO"/>
+        </w:rPr>
+        <w:t>₂(</w:t>
+      </w:r>
+      <w:proofErr w:type="gramEnd"/>
+      <w:r>
+        <w:rPr>
+          <w:rFonts w:ascii="Times New Roman" w:hAnsi="Times New Roman" w:cs="Times New Roman"/>
+          <w:lang w:val="es-CO"/>
+        </w:rPr>
+        <w:t>1177)</w:t>
+      </w:r>
+      <w:r>
+        <w:rPr>
+          <w:rFonts w:ascii="Times New Roman" w:hAnsi="Times New Roman" w:cs="Times New Roman"/>
+          <w:lang w:val="es-CO"/>
+        </w:rPr>
+        <w:t xml:space="preserve"> </w:t>
+      </w:r>
+      <w:r>
+        <w:rPr>
+          <w:rFonts w:ascii="Times New Roman" w:hAnsi="Times New Roman" w:cs="Times New Roman"/>
+          <w:lang w:val="es-CO"/>
+        </w:rPr>
+        <w:t>que es cerca de 10</w:t>
+      </w:r>
+      <w:r>
+        <w:rPr>
+          <w:rFonts w:ascii="Times New Roman" w:hAnsi="Times New Roman" w:cs="Times New Roman"/>
+          <w:lang w:val="es-CO"/>
+        </w:rPr>
+        <w:t xml:space="preserve"> pero c</w:t>
+      </w:r>
+      <w:r>
+        <w:rPr>
+          <w:rFonts w:ascii="Times New Roman" w:hAnsi="Times New Roman" w:cs="Times New Roman"/>
+          <w:lang w:val="es-CO"/>
+        </w:rPr>
+        <w:t>omo salió casi el triple, se ve que el árbol está desbalanceado.</w:t>
+      </w:r>
+    </w:p>
+    <w:p>
+      <w:pPr>
+        <w:pStyle w:val="Prrafodelista"/>
+        <w:spacing w:after="0"/>
+        <w:rPr>
+          <w:rFonts w:ascii="Times New Roman" w:hAnsi="Times New Roman" w:cs="Times New Roman"/>
+          <w:lang w:val="es-CO"/>
+        </w:rPr>
+      </w:pPr>
+    </w:p>
+    <w:p>
+      <w:pPr>
+        <w:spacing w:after="0"/>
+        <w:rPr>
+          <w:rFonts w:ascii="Times New Roman" w:hAnsi="Times New Roman" w:cs="Times New Roman"/>
+          <w:lang w:val="es-CO"/>
+        </w:rPr>
+      </w:pPr>
+      <w:r>
+        <w:rPr>
+          <w:rFonts w:ascii="Times New Roman" w:hAnsi="Times New Roman" w:cs="Times New Roman"/>
+          <w:lang w:val="es-CO"/>
+        </w:rPr>
+        <w:t>Esto pasa porque el BST no se balancea solo. La forma depende del orden en que llegan las llaves</w:t>
+      </w:r>
+      <w:r>
+        <w:rPr>
+          <w:rFonts w:ascii="Times New Roman" w:hAnsi="Times New Roman" w:cs="Times New Roman"/>
+          <w:lang w:val="es-CO"/>
+        </w:rPr>
+        <w:t>, s</w:t>
+      </w:r>
+      <w:r>
+        <w:rPr>
+          <w:rFonts w:ascii="Times New Roman" w:hAnsi="Times New Roman" w:cs="Times New Roman"/>
+          <w:lang w:val="es-CO"/>
+        </w:rPr>
+        <w:t>i las fechas llegan casi en orden el árbol crece mucho hacia un lado, y en el peor caso queda como un</w:t>
+      </w:r>
+      <w:r>
+        <w:rPr>
+          <w:rFonts w:ascii="Times New Roman" w:hAnsi="Times New Roman" w:cs="Times New Roman"/>
+          <w:lang w:val="es-CO"/>
+        </w:rPr>
+        <w:t xml:space="preserve"> </w:t>
+      </w:r>
+      <w:proofErr w:type="gramStart"/>
+      <w:r>
+        <w:rPr>
+          <w:rFonts w:ascii="Times New Roman" w:hAnsi="Times New Roman" w:cs="Times New Roman"/>
+          <w:lang w:val="es-CO"/>
+        </w:rPr>
+        <w:t>single</w:t>
+      </w:r>
+      <w:proofErr w:type="gramEnd"/>
+      <w:r>
+        <w:rPr>
+          <w:rFonts w:ascii="Times New Roman" w:hAnsi="Times New Roman" w:cs="Times New Roman"/>
+          <w:lang w:val="es-CO"/>
+        </w:rPr>
+        <w:t xml:space="preserve"> </w:t>
+      </w:r>
+      <w:proofErr w:type="spellStart"/>
+      <w:r>
+        <w:rPr>
+          <w:rFonts w:ascii="Times New Roman" w:hAnsi="Times New Roman" w:cs="Times New Roman"/>
+          <w:lang w:val="es-CO"/>
+        </w:rPr>
+        <w:t>linked</w:t>
+      </w:r>
+      <w:proofErr w:type="spellEnd"/>
+      <w:r>
+        <w:rPr>
+          <w:rFonts w:ascii="Times New Roman" w:hAnsi="Times New Roman" w:cs="Times New Roman"/>
+          <w:lang w:val="es-CO"/>
+        </w:rPr>
+        <w:t xml:space="preserve"> </w:t>
+      </w:r>
+      <w:proofErr w:type="spellStart"/>
+      <w:r>
+        <w:rPr>
+          <w:rFonts w:ascii="Times New Roman" w:hAnsi="Times New Roman" w:cs="Times New Roman"/>
+          <w:lang w:val="es-CO"/>
+        </w:rPr>
+        <w:t>list</w:t>
+      </w:r>
+      <w:proofErr w:type="spellEnd"/>
+      <w:r>
+        <w:rPr>
+          <w:rFonts w:ascii="Times New Roman" w:hAnsi="Times New Roman" w:cs="Times New Roman"/>
+          <w:lang w:val="es-CO"/>
+        </w:rPr>
+        <w:t xml:space="preserve"> </w:t>
+      </w:r>
+      <w:r>
+        <w:rPr>
+          <w:rFonts w:ascii="Times New Roman" w:hAnsi="Times New Roman" w:cs="Times New Roman"/>
+          <w:lang w:val="es-CO"/>
+        </w:rPr>
+        <w:t>con altura casi igual al número de elementos.</w:t>
+      </w:r>
+    </w:p>
+    <w:p>
+      <w:pPr>
+        <w:pStyle w:val="Prrafodelista"/>
+        <w:spacing w:after="0"/>
+        <w:jc w:val="both"/>
+        <w:rPr>
+          <w:rFonts w:ascii="Times New Roman" w:hAnsi="Times New Roman" w:cs="Times New Roman"/>
+          <w:lang w:val="es-CO"/>
+        </w:rPr>
+      </w:pPr>
     </w:p>
     <w:p>
       <w:pPr>
@@ -177,10 +328,47 @@
         <w:ind w:left="0"/>
         <w:jc w:val="both"/>
         <w:rPr>
-          <w:rFonts w:ascii="Dax-Regular" w:hAnsi="Dax-Regular"/>
-          <w:lang w:val="es-CO"/>
-        </w:rPr>
-      </w:pPr>
+          <w:rFonts w:ascii="Times New Roman" w:hAnsi="Times New Roman" w:cs="Times New Roman"/>
+          <w:lang w:val="es-CO"/>
+        </w:rPr>
+      </w:pPr>
+      <w:r>
+        <w:rPr>
+          <w:rFonts w:ascii="Times New Roman" w:hAnsi="Times New Roman" w:cs="Times New Roman"/>
+          <w:lang w:val="es-CO"/>
+        </w:rPr>
+        <w:t>Entonces la relación no es fija. La altura puede ir desde log n hasta n</w:t>
+      </w:r>
+      <w:r>
+        <w:rPr>
+          <w:rFonts w:ascii="Times New Roman" w:hAnsi="Times New Roman" w:cs="Times New Roman"/>
+          <w:lang w:val="es-CO"/>
+        </w:rPr>
+        <w:t xml:space="preserve">. </w:t>
+      </w:r>
+      <w:r>
+        <w:rPr>
+          <w:rFonts w:ascii="Times New Roman" w:hAnsi="Times New Roman" w:cs="Times New Roman"/>
+          <w:lang w:val="es-CO"/>
+        </w:rPr>
+        <w:t xml:space="preserve">Eso importa porque buscar, insertar y consultar rangos cuestan O(altura), no siempre </w:t>
+      </w:r>
+      <w:proofErr w:type="gramStart"/>
+      <w:r>
+        <w:rPr>
+          <w:rFonts w:ascii="Times New Roman" w:hAnsi="Times New Roman" w:cs="Times New Roman"/>
+          <w:lang w:val="es-CO"/>
+        </w:rPr>
+        <w:t>O(</w:t>
+      </w:r>
+      <w:proofErr w:type="gramEnd"/>
+      <w:r>
+        <w:rPr>
+          <w:rFonts w:ascii="Times New Roman" w:hAnsi="Times New Roman" w:cs="Times New Roman"/>
+          <w:lang w:val="es-CO"/>
+        </w:rPr>
+        <w:t>log n). Un árbol rojo-negro evitaría el problema porque mantiene la altura cerca de log n.</w:t>
+      </w:r>
     </w:p>
     <w:p>
       <w:pPr>
@@ -189,7 +377,7 @@
         <w:ind w:left="0"/>
         <w:jc w:val="both"/>
         <w:rPr>
-          <w:rFonts w:ascii="Dax-Regular" w:hAnsi="Dax-Regular"/>
+          <w:rFonts w:ascii="Times New Roman" w:hAnsi="Times New Roman" w:cs="Times New Roman"/>
           <w:lang w:val="es-CO"/>
         </w:rPr>
       </w:pPr>
@@ -204,27 +392,35 @@
         <w:spacing w:after="0"/>
         <w:jc w:val="both"/>
         <w:rPr>
-          <w:rFonts w:ascii="Dax-Regular" w:hAnsi="Dax-Regular"/>
-          <w:lang w:val="es-CO"/>
-        </w:rPr>
-      </w:pPr>
-      <w:r>
-        <w:rPr>
-          <w:rFonts w:ascii="Dax-Regular" w:hAnsi="Dax-Regular"/>
+          <w:rFonts w:ascii="Times New Roman" w:hAnsi="Times New Roman" w:cs="Times New Roman"/>
+          <w:b/>
+          <w:bCs/>
+          <w:lang w:val="es-CO"/>
+        </w:rPr>
+      </w:pPr>
+      <w:r>
+        <w:rPr>
+          <w:rFonts w:ascii="Times New Roman" w:hAnsi="Times New Roman" w:cs="Times New Roman"/>
+          <w:b/>
+          <w:bCs/>
           <w:lang w:val="es-CO"/>
         </w:rPr>
         <w:t xml:space="preserve">Si tuviera que responder esa misma consulta y la información estuviera en tablas de hash y no en un BST, </w:t>
       </w:r>
       <w:r>
         <w:rPr>
-          <w:rFonts w:ascii="Dax-Regular" w:hAnsi="Dax-Regular"/>
+          <w:rFonts w:ascii="Times New Roman" w:hAnsi="Times New Roman" w:cs="Times New Roman"/>
+          <w:b/>
+          <w:bCs/>
           <w:lang w:val="es-CO"/>
         </w:rPr>
         <w:t>¿</w:t>
       </w:r>
       <w:r>
         <w:rPr>
-          <w:rFonts w:ascii="Dax-Regular" w:hAnsi="Dax-Regular"/>
+          <w:rFonts w:ascii="Times New Roman" w:hAnsi="Times New Roman" w:cs="Times New Roman"/>
+          <w:b/>
+          <w:bCs/>
           <w:lang w:val="es-CO"/>
         </w:rPr>
         <w:t>cree que el tiempo de respuesta sería mayor o menor? ¿Por qué?</w:t>
@@ -233,19 +429,162 @@
     <w:p>
       <w:pPr>
         <w:pStyle w:val="Prrafodelista"/>
-        <w:ind w:left="0"/>
-        <w:rPr>
-          <w:rFonts w:ascii="Dax-Regular" w:hAnsi="Dax-Regular"/>
+        <w:spacing w:after="0"/>
+        <w:ind w:left="360"/>
+        <w:jc w:val="both"/>
+        <w:rPr>
+          <w:rFonts w:ascii="Times New Roman" w:hAnsi="Times New Roman" w:cs="Times New Roman"/>
+          <w:b/>
+          <w:bCs/>
           <w:lang w:val="es-CO"/>
         </w:rPr>
       </w:pPr>
     </w:p>
     <w:p>
       <w:pPr>
+        <w:rPr>
+          <w:rFonts w:ascii="Times New Roman" w:hAnsi="Times New Roman" w:cs="Times New Roman"/>
+          <w:lang w:val="es-CO"/>
+        </w:rPr>
+      </w:pPr>
+      <w:r>
+        <w:rPr>
+          <w:rFonts w:ascii="Times New Roman" w:hAnsi="Times New Roman" w:cs="Times New Roman"/>
+          <w:lang w:val="es-CO"/>
+        </w:rPr>
+        <w:t>Sería mayor. Una tabla de hash reparte las llaves por posiciones calculadas así que no guarda ningún orden. Eso sirve para buscar una llave exacta que es muy rápido (</w:t>
+      </w:r>
+      <w:proofErr w:type="gramStart"/>
+      <w:r>
+        <w:rPr>
+          <w:rFonts w:ascii="Times New Roman" w:hAnsi="Times New Roman" w:cs="Times New Roman"/>
+          <w:lang w:val="es-CO"/>
+        </w:rPr>
+        <w:t>O(</w:t>
+      </w:r>
+      <w:proofErr w:type="gramEnd"/>
+      <w:r>
+        <w:rPr>
+          <w:rFonts w:ascii="Times New Roman" w:hAnsi="Times New Roman" w:cs="Times New Roman"/>
+          <w:lang w:val="es-CO"/>
+        </w:rPr>
+        <w:t>1) en promedio), pero no para pedir “todas las fechas entre A y B”</w:t>
+      </w:r>
+      <w:r>
+        <w:rPr>
+          <w:rFonts w:ascii="Times New Roman" w:hAnsi="Times New Roman" w:cs="Times New Roman"/>
+          <w:lang w:val="es-CO"/>
+        </w:rPr>
+        <w:t xml:space="preserve"> como </w:t>
+      </w:r>
+      <w:r>
+        <w:rPr>
+          <w:rFonts w:ascii="Times New Roman" w:hAnsi="Times New Roman" w:cs="Times New Roman"/>
+          <w:lang w:val="es-CO"/>
+        </w:rPr>
+        <w:t xml:space="preserve">los ejemplos que se ejecutaron con el </w:t>
+      </w:r>
+      <w:proofErr w:type="spellStart"/>
+      <w:r>
+        <w:rPr>
+          <w:rFonts w:ascii="Times New Roman" w:hAnsi="Times New Roman" w:cs="Times New Roman"/>
+          <w:lang w:val="es-CO"/>
+        </w:rPr>
+        <w:t>view</w:t>
+      </w:r>
+      <w:proofErr w:type="spellEnd"/>
+      <w:r>
+        <w:rPr>
+          <w:rFonts w:ascii="Times New Roman" w:hAnsi="Times New Roman" w:cs="Times New Roman"/>
+          <w:lang w:val="es-CO"/>
+        </w:rPr>
+        <w:t xml:space="preserve"> del archivo en este caso.</w:t>
+      </w:r>
+    </w:p>
+    <w:p>
+      <w:pPr>
+        <w:rPr>
+          <w:rFonts w:ascii="Times New Roman" w:hAnsi="Times New Roman" w:cs="Times New Roman"/>
+          <w:lang w:val="es-CO"/>
+        </w:rPr>
+      </w:pPr>
+      <w:r>
+        <w:rPr>
+          <w:rFonts w:ascii="Times New Roman" w:hAnsi="Times New Roman" w:cs="Times New Roman"/>
+          <w:lang w:val="es-CO"/>
+        </w:rPr>
+        <w:t xml:space="preserve">Con una tabla de hash habría que revisar todas las llaves (O(n)) y quedarse con las que caen en el rango. También se podría probar cada fecha posible del </w:t>
+      </w:r>
+      <w:proofErr w:type="gramStart"/>
+      <w:r>
+        <w:rPr>
+          <w:rFonts w:ascii="Times New Roman" w:hAnsi="Times New Roman" w:cs="Times New Roman"/>
+          <w:lang w:val="es-CO"/>
+        </w:rPr>
+        <w:t>rango</w:t>
+      </w:r>
+      <w:proofErr w:type="gramEnd"/>
+      <w:r>
+        <w:rPr>
+          <w:rFonts w:ascii="Times New Roman" w:hAnsi="Times New Roman" w:cs="Times New Roman"/>
+          <w:lang w:val="es-CO"/>
+        </w:rPr>
+        <w:t xml:space="preserve"> pero eso es lento si el rango es grande.</w:t>
+      </w:r>
+    </w:p>
+    <w:p>
+      <w:pPr>
         <w:pStyle w:val="Prrafodelista"/>
         <w:ind w:left="0"/>
         <w:rPr>
-          <w:rFonts w:ascii="Dax-Regular" w:hAnsi="Dax-Regular"/>
+          <w:rFonts w:ascii="Times New Roman" w:hAnsi="Times New Roman" w:cs="Times New Roman"/>
+          <w:lang w:val="es-CO"/>
+        </w:rPr>
+      </w:pPr>
+      <w:r>
+        <w:rPr>
+          <w:rFonts w:ascii="Times New Roman" w:hAnsi="Times New Roman" w:cs="Times New Roman"/>
+          <w:lang w:val="es-CO"/>
+        </w:rPr>
+        <w:t xml:space="preserve">En el BST las llaves están ordenadas. La consulta baja por el árbol se salta los subárboles que quedan fuera del rango y solo recorre las partes que sí importan. Su costo es más o menos </w:t>
+      </w:r>
+      <w:proofErr w:type="gramStart"/>
+      <w:r>
+        <w:rPr>
+          <w:rFonts w:ascii="Times New Roman" w:hAnsi="Times New Roman" w:cs="Times New Roman"/>
+          <w:lang w:val="es-CO"/>
+        </w:rPr>
+        <w:t>O(</w:t>
+      </w:r>
+      <w:proofErr w:type="gramEnd"/>
+      <w:r>
+        <w:rPr>
+          <w:rFonts w:ascii="Times New Roman" w:hAnsi="Times New Roman" w:cs="Times New Roman"/>
+          <w:lang w:val="es-CO"/>
+        </w:rPr>
+        <w:t>altura + k), donde k es el número de elementos que están en el rango. Por eso el BST responde mejor las consultas por rango. Con solo 1177 fechas la diferencia sería pequeña pero</w:t>
+      </w:r>
+      <w:r>
+        <w:rPr>
+          <w:rFonts w:ascii="Times New Roman" w:hAnsi="Times New Roman" w:cs="Times New Roman"/>
+          <w:lang w:val="es-CO"/>
+        </w:rPr>
+        <w:t xml:space="preserve"> obviamente</w:t>
+      </w:r>
+      <w:r>
+        <w:rPr>
+          <w:rFonts w:ascii="Times New Roman" w:hAnsi="Times New Roman" w:cs="Times New Roman"/>
+          <w:lang w:val="es-CO"/>
+        </w:rPr>
+        <w:t xml:space="preserve"> crece con más datos.</w:t>
+      </w:r>
+    </w:p>
+    <w:p>
+      <w:pPr>
+        <w:pStyle w:val="Prrafodelista"/>
+        <w:ind w:left="0"/>
+        <w:rPr>
+          <w:rFonts w:ascii="Times New Roman" w:hAnsi="Times New Roman" w:cs="Times New Roman"/>
           <w:lang w:val="es-CO"/>
         </w:rPr>
       </w:pPr>
@@ -260,13 +599,17 @@
         <w:spacing w:after="0"/>
         <w:jc w:val="both"/>
         <w:rPr>
-          <w:rFonts w:ascii="Dax-Regular" w:hAnsi="Dax-Regular"/>
-          <w:lang w:val="es-CO"/>
-        </w:rPr>
-      </w:pPr>
-      <w:r>
-        <w:rPr>
-          <w:rFonts w:ascii="Dax-Regular" w:hAnsi="Dax-Regular"/>
+          <w:rFonts w:ascii="Times New Roman" w:hAnsi="Times New Roman" w:cs="Times New Roman"/>
+          <w:b/>
+          <w:bCs/>
+          <w:lang w:val="es-CO"/>
+        </w:rPr>
+      </w:pPr>
+      <w:r>
+        <w:rPr>
+          <w:rFonts w:ascii="Times New Roman" w:hAnsi="Times New Roman" w:cs="Times New Roman"/>
+          <w:b/>
+          <w:bCs/>
           <w:lang w:val="es-CO"/>
         </w:rPr>
         <w:t>¿Qué operación del TAD se utiliza para retornar una lista con la información encontrada en un rango de fechas?</w:t>
@@ -274,7 +617,261 @@
     </w:p>
     <w:p>
       <w:pPr>
-        <w:pStyle w:val="Prrafodelista"/>
+        <w:pStyle w:val="NormalWeb"/>
+        <w:rPr>
+          <w:sz w:val="22"/>
+          <w:szCs w:val="22"/>
+        </w:rPr>
+      </w:pPr>
+      <w:r>
+        <w:rPr>
+          <w:sz w:val="22"/>
+          <w:szCs w:val="22"/>
+        </w:rPr>
+        <w:t xml:space="preserve">La operación es </w:t>
+      </w:r>
+      <w:proofErr w:type="spellStart"/>
+      <w:proofErr w:type="gramStart"/>
+      <w:r>
+        <w:rPr>
+          <w:rStyle w:val="CdigoHTML"/>
+          <w:rFonts w:ascii="Times New Roman" w:hAnsi="Times New Roman" w:cs="Times New Roman"/>
+          <w:sz w:val="22"/>
+          <w:szCs w:val="22"/>
+        </w:rPr>
+        <w:t>values</w:t>
+      </w:r>
+      <w:proofErr w:type="spellEnd"/>
+      <w:r>
+        <w:rPr>
+          <w:rStyle w:val="CdigoHTML"/>
+          <w:rFonts w:ascii="Times New Roman" w:hAnsi="Times New Roman" w:cs="Times New Roman"/>
+          <w:sz w:val="22"/>
+          <w:szCs w:val="22"/>
+        </w:rPr>
+        <w:t>(</w:t>
+      </w:r>
+      <w:proofErr w:type="spellStart"/>
+      <w:proofErr w:type="gramEnd"/>
+      <w:r>
+        <w:rPr>
+          <w:rStyle w:val="CdigoHTML"/>
+          <w:rFonts w:ascii="Times New Roman" w:hAnsi="Times New Roman" w:cs="Times New Roman"/>
+          <w:sz w:val="22"/>
+          <w:szCs w:val="22"/>
+        </w:rPr>
+        <w:t>my_bst</w:t>
+      </w:r>
+      <w:proofErr w:type="spellEnd"/>
+      <w:r>
+        <w:rPr>
+          <w:rStyle w:val="CdigoHTML"/>
+          <w:rFonts w:ascii="Times New Roman" w:hAnsi="Times New Roman" w:cs="Times New Roman"/>
+          <w:sz w:val="22"/>
+          <w:szCs w:val="22"/>
+        </w:rPr>
+        <w:t xml:space="preserve">, </w:t>
+      </w:r>
+      <w:proofErr w:type="spellStart"/>
+      <w:r>
+        <w:rPr>
+          <w:rStyle w:val="CdigoHTML"/>
+          <w:rFonts w:ascii="Times New Roman" w:hAnsi="Times New Roman" w:cs="Times New Roman"/>
+          <w:sz w:val="22"/>
+          <w:szCs w:val="22"/>
+        </w:rPr>
+        <w:t>key_initial</w:t>
+      </w:r>
+      <w:proofErr w:type="spellEnd"/>
+      <w:r>
+        <w:rPr>
+          <w:rStyle w:val="CdigoHTML"/>
+          <w:rFonts w:ascii="Times New Roman" w:hAnsi="Times New Roman" w:cs="Times New Roman"/>
+          <w:sz w:val="22"/>
+          <w:szCs w:val="22"/>
+        </w:rPr>
+        <w:t xml:space="preserve">, </w:t>
+      </w:r>
+      <w:proofErr w:type="spellStart"/>
+      <w:r>
+        <w:rPr>
+          <w:rStyle w:val="CdigoHTML"/>
+          <w:rFonts w:ascii="Times New Roman" w:hAnsi="Times New Roman" w:cs="Times New Roman"/>
+          <w:sz w:val="22"/>
+          <w:szCs w:val="22"/>
+        </w:rPr>
+        <w:t>key_final</w:t>
+      </w:r>
+      <w:proofErr w:type="spellEnd"/>
+      <w:r>
+        <w:rPr>
+          <w:rStyle w:val="CdigoHTML"/>
+          <w:rFonts w:ascii="Times New Roman" w:hAnsi="Times New Roman" w:cs="Times New Roman"/>
+          <w:sz w:val="22"/>
+          <w:szCs w:val="22"/>
+        </w:rPr>
+        <w:t>)</w:t>
+      </w:r>
+      <w:r>
+        <w:rPr>
+          <w:sz w:val="22"/>
+          <w:szCs w:val="22"/>
+        </w:rPr>
+        <w:t>. Recibe el árbol y las dos fechas de los límites, y devuelve una lista con los valores de todas las llaves que están entre las dos (incluyéndolas).</w:t>
+      </w:r>
+    </w:p>
+    <w:p>
+      <w:pPr>
+        <w:pStyle w:val="NormalWeb"/>
+        <w:rPr>
+          <w:sz w:val="22"/>
+          <w:szCs w:val="22"/>
+        </w:rPr>
+      </w:pPr>
+      <w:proofErr w:type="spellStart"/>
+      <w:r>
+        <w:rPr>
+          <w:rStyle w:val="CdigoHTML"/>
+          <w:rFonts w:ascii="Times New Roman" w:hAnsi="Times New Roman" w:cs="Times New Roman"/>
+          <w:sz w:val="22"/>
+          <w:szCs w:val="22"/>
+        </w:rPr>
+        <w:t>values</w:t>
+      </w:r>
+      <w:proofErr w:type="spellEnd"/>
+      <w:r>
+        <w:rPr>
+          <w:sz w:val="22"/>
+          <w:szCs w:val="22"/>
+        </w:rPr>
+        <w:t xml:space="preserve"> es la función “máscara”</w:t>
+      </w:r>
+      <w:r>
+        <w:rPr>
+          <w:sz w:val="22"/>
+          <w:szCs w:val="22"/>
+        </w:rPr>
+        <w:t>, (termino adoptado en clases magistrales), la cual p</w:t>
+      </w:r>
+      <w:r>
+        <w:rPr>
+          <w:sz w:val="22"/>
+          <w:szCs w:val="22"/>
+        </w:rPr>
+        <w:t xml:space="preserve">repara la lista vacía y llama a la función recursiva </w:t>
+      </w:r>
+      <w:proofErr w:type="spellStart"/>
+      <w:r>
+        <w:rPr>
+          <w:rStyle w:val="CdigoHTML"/>
+          <w:rFonts w:ascii="Times New Roman" w:hAnsi="Times New Roman" w:cs="Times New Roman"/>
+          <w:sz w:val="22"/>
+          <w:szCs w:val="22"/>
+        </w:rPr>
+        <w:t>values_range</w:t>
+      </w:r>
+      <w:proofErr w:type="spellEnd"/>
+      <w:r>
+        <w:rPr>
+          <w:sz w:val="22"/>
+          <w:szCs w:val="22"/>
+        </w:rPr>
+        <w:t>, que es la que recorre el árbol. Compara los límites con la llave de cada nodo</w:t>
+      </w:r>
+      <w:r>
+        <w:rPr>
+          <w:sz w:val="22"/>
+          <w:szCs w:val="22"/>
+        </w:rPr>
+        <w:t xml:space="preserve">, entonces, </w:t>
+      </w:r>
+      <w:r>
+        <w:rPr>
+          <w:sz w:val="22"/>
+          <w:szCs w:val="22"/>
+        </w:rPr>
+        <w:t>si el límite inferior es menor baja por la izquierda</w:t>
+      </w:r>
+      <w:r>
+        <w:rPr>
+          <w:sz w:val="22"/>
+          <w:szCs w:val="22"/>
+        </w:rPr>
+        <w:t>,</w:t>
+      </w:r>
+      <w:r>
+        <w:rPr>
+          <w:sz w:val="22"/>
+          <w:szCs w:val="22"/>
+        </w:rPr>
+        <w:t xml:space="preserve"> si la llave está dentro del rango</w:t>
+      </w:r>
+      <w:r>
+        <w:rPr>
+          <w:sz w:val="22"/>
+          <w:szCs w:val="22"/>
+        </w:rPr>
+        <w:t xml:space="preserve"> </w:t>
+      </w:r>
+      <w:r>
+        <w:rPr>
+          <w:sz w:val="22"/>
+          <w:szCs w:val="22"/>
+        </w:rPr>
+        <w:lastRenderedPageBreak/>
+        <w:t>agrega el valor</w:t>
+      </w:r>
+      <w:r>
+        <w:rPr>
+          <w:sz w:val="22"/>
+          <w:szCs w:val="22"/>
+        </w:rPr>
+        <w:t xml:space="preserve">, </w:t>
+      </w:r>
+      <w:r>
+        <w:rPr>
+          <w:sz w:val="22"/>
+          <w:szCs w:val="22"/>
+        </w:rPr>
+        <w:t xml:space="preserve">si el límite superior es mayor baja por la derecha. En </w:t>
+      </w:r>
+      <w:r>
+        <w:rPr>
+          <w:rStyle w:val="CdigoHTML"/>
+          <w:rFonts w:ascii="Times New Roman" w:hAnsi="Times New Roman" w:cs="Times New Roman"/>
+          <w:sz w:val="22"/>
+          <w:szCs w:val="22"/>
+        </w:rPr>
+        <w:t>logic.py</w:t>
+      </w:r>
+      <w:r>
+        <w:rPr>
+          <w:sz w:val="22"/>
+          <w:szCs w:val="22"/>
+        </w:rPr>
+        <w:t xml:space="preserve"> se usa en </w:t>
+      </w:r>
+      <w:proofErr w:type="spellStart"/>
+      <w:r>
+        <w:rPr>
+          <w:rStyle w:val="CdigoHTML"/>
+          <w:rFonts w:ascii="Times New Roman" w:hAnsi="Times New Roman" w:cs="Times New Roman"/>
+          <w:sz w:val="22"/>
+          <w:szCs w:val="22"/>
+        </w:rPr>
+        <w:t>get_crimes_by_range</w:t>
+      </w:r>
+      <w:proofErr w:type="spellEnd"/>
+      <w:r>
+        <w:rPr>
+          <w:sz w:val="22"/>
+          <w:szCs w:val="22"/>
+        </w:rPr>
+        <w:t>, y cada valor es un nodo de fecha con su lista de crímenes.</w:t>
+      </w:r>
+    </w:p>
+    <w:p>
+      <w:pPr>
         <w:rPr>
           <w:rFonts w:ascii="Dax-Regular" w:hAnsi="Dax-Regular"/>
           <w:lang w:val="es-CO"/>
@@ -1933,9 +2530,6 @@
     <w:name w:val="Normal"/>
     <w:qFormat/>
     <w:rsid w:val="003B5453"/>
-    <w:rPr>
-      <w:noProof/>
-    </w:rPr>
   </w:style>
   <w:style w:type="paragraph" w:styleId="Ttulo1">
     <w:name w:val="heading 1"/>
@@ -1983,7 +2577,6 @@
   <w:style w:type="character" w:default="1" w:styleId="Fuentedeprrafopredeter">
     <w:name w:val="Default Paragraph Font"/>
     <w:uiPriority w:val="1"/>
-    <w:semiHidden/>
     <w:unhideWhenUsed/>
   </w:style>
   <w:style w:type="table" w:default="1" w:styleId="Tablanormal">
@@ -2052,9 +2645,6 @@
       <w:ind w:left="720"/>
       <w:contextualSpacing/>
     </w:pPr>
-    <w:rPr>
-      <w:noProof w:val="0"/>
-    </w:rPr>
   </w:style>
   <w:style w:type="character" w:styleId="Refdecomentario">
     <w:name w:val="annotation reference"/>
@@ -2080,7 +2670,6 @@
       <w:spacing w:line="240" w:lineRule="auto"/>
     </w:pPr>
     <w:rPr>
-      <w:noProof w:val="0"/>
       <w:sz w:val="20"/>
       <w:szCs w:val="20"/>
     </w:rPr>
@@ -2111,7 +2700,6 @@
     <w:rPr>
       <w:i/>
       <w:iCs/>
-      <w:noProof w:val="0"/>
       <w:color w:val="44546A" w:themeColor="text2"/>
       <w:sz w:val="18"/>
       <w:szCs w:val="18"/>
@@ -2218,6 +2806,36 @@
       <w:color w:val="2F5496" w:themeColor="accent1" w:themeShade="BF"/>
       <w:sz w:val="26"/>
       <w:szCs w:val="26"/>
+    </w:rPr>
+  </w:style>
+  <w:style w:type="paragraph" w:styleId="NormalWeb">
+    <w:name w:val="Normal (Web)"/>
+    <w:basedOn w:val="Normal"/>
+    <w:uiPriority w:val="99"/>
+    <w:semiHidden/>
+    <w:unhideWhenUsed/>
+    <w:rsid w:val="00445409"/>
+    <w:pPr>
+      <w:spacing w:before="100" w:beforeAutospacing="1" w:after="100" w:afterAutospacing="1" w:line="240" w:lineRule="auto"/>
+    </w:pPr>
+    <w:rPr>
+      <w:rFonts w:ascii="Times New Roman" w:eastAsia="Times New Roman" w:hAnsi="Times New Roman" w:cs="Times New Roman"/>
+      <w:sz w:val="24"/>
+      <w:szCs w:val="24"/>
+      <w:lang w:val="es-CO" w:eastAsia="es-CO"/>
+    </w:rPr>
+  </w:style>
+  <w:style w:type="character" w:styleId="CdigoHTML">
+    <w:name w:val="HTML Code"/>
+    <w:basedOn w:val="Fuentedeprrafopredeter"/>
+    <w:uiPriority w:val="99"/>
+    <w:semiHidden/>
+    <w:unhideWhenUsed/>
+    <w:rsid w:val="00445409"/>
+    <w:rPr>
+      <w:rFonts w:ascii="Courier New" w:eastAsia="Times New Roman" w:hAnsi="Courier New" w:cs="Courier New"/>
+      <w:sz w:val="20"/>
+      <w:szCs w:val="20"/>
     </w:rPr>
   </w:style>
 </w:styles>
@@ -2519,26 +3137,6 @@
 </file>
 
 <file path=customXml/item1.xml><?xml version="1.0" encoding="utf-8"?>
-<?mso-contentType ?>
-<FormTemplates xmlns="http://schemas.microsoft.com/sharepoint/v3/contenttype/forms">
-  <Display>DocumentLibraryForm</Display>
-  <Edit>DocumentLibraryForm</Edit>
-  <New>DocumentLibraryForm</New>
-</FormTemplates>
-</file>
-
-<file path=customXml/item2.xml><?xml version="1.0" encoding="utf-8"?>
-<p:properties xmlns:p="http://schemas.microsoft.com/office/2006/metadata/properties" xmlns:xsi="http://www.w3.org/2001/XMLSchema-instance" xmlns:pc="http://schemas.microsoft.com/office/infopath/2007/PartnerControls">
-  <documentManagement>
-    <TaxCatchAll xmlns="85e30bcc-d76c-4413-8e4d-2dce22fb0743" xsi:nil="true"/>
-    <lcf76f155ced4ddcb4097134ff3c332f xmlns="164883f8-7691-4ecf-b54a-664c0d0edefe">
-      <Terms xmlns="http://schemas.microsoft.com/office/infopath/2007/PartnerControls"/>
-    </lcf76f155ced4ddcb4097134ff3c332f>
-  </documentManagement>
-</p:properties>
-</file>
-
-<file path=customXml/item3.xml><?xml version="1.0" encoding="utf-8"?>
 <ct:contentTypeSchema xmlns:ct="http://schemas.microsoft.com/office/2006/metadata/contentType" xmlns:ma="http://schemas.microsoft.com/office/2006/metadata/properties/metaAttributes" ct:_="" ma:_="" ma:contentTypeName="Documento" ma:contentTypeID="0x01010023858CF01A2EF24688B692775F4C60A4" ma:contentTypeVersion="17" ma:contentTypeDescription="Crear nuevo documento." ma:contentTypeScope="" ma:versionID="af74a0f8eb440a60883e9dd833f0742f">
   <xsd:schema xmlns:xsd="http://www.w3.org/2001/XMLSchema" xmlns:xs="http://www.w3.org/2001/XMLSchema" xmlns:p="http://schemas.microsoft.com/office/2006/metadata/properties" xmlns:ns2="164883f8-7691-4ecf-b54a-664c0d0edefe" xmlns:ns3="85e30bcc-d76c-4413-8e4d-2dce22fb0743" targetNamespace="http://schemas.microsoft.com/office/2006/metadata/properties" ma:root="true" ma:fieldsID="f5ceeff32ffca1089660572a8ebd1782" ns2:_="" ns3:_="">
     <xsd:import namespace="164883f8-7691-4ecf-b54a-664c0d0edefe"/>
@@ -2787,10 +3385,41 @@
 </ct:contentTypeSchema>
 </file>
 
+<file path=customXml/item2.xml><?xml version="1.0" encoding="utf-8"?>
+<p:properties xmlns:p="http://schemas.microsoft.com/office/2006/metadata/properties" xmlns:xsi="http://www.w3.org/2001/XMLSchema-instance" xmlns:pc="http://schemas.microsoft.com/office/infopath/2007/PartnerControls">
+  <documentManagement>
+    <TaxCatchAll xmlns="85e30bcc-d76c-4413-8e4d-2dce22fb0743" xsi:nil="true"/>
+    <lcf76f155ced4ddcb4097134ff3c332f xmlns="164883f8-7691-4ecf-b54a-664c0d0edefe">
+      <Terms xmlns="http://schemas.microsoft.com/office/infopath/2007/PartnerControls"/>
+    </lcf76f155ced4ddcb4097134ff3c332f>
+  </documentManagement>
+</p:properties>
+</file>
+
+<file path=customXml/item3.xml><?xml version="1.0" encoding="utf-8"?>
+<?mso-contentType ?>
+<FormTemplates xmlns="http://schemas.microsoft.com/sharepoint/v3/contenttype/forms">
+  <Display>DocumentLibraryForm</Display>
+  <Edit>DocumentLibraryForm</Edit>
+  <New>DocumentLibraryForm</New>
+</FormTemplates>
+</file>
+
 <file path=customXml/itemProps1.xml><?xml version="1.0" encoding="utf-8"?>
-<ds:datastoreItem xmlns:ds="http://schemas.openxmlformats.org/officeDocument/2006/customXml" ds:itemID="{1F59EA8B-1FA8-40D2-A8B0-61B9CE1E4579}">
+<ds:datastoreItem xmlns:ds="http://schemas.openxmlformats.org/officeDocument/2006/customXml" ds:itemID="{84308E8E-45E8-4576-AFDB-330AF0432F54}">
   <ds:schemaRefs>
-    <ds:schemaRef ds:uri="http://schemas.microsoft.com/sharepoint/v3/contenttype/forms"/>
+    <ds:schemaRef ds:uri="http://schemas.microsoft.com/office/2006/metadata/contentType"/>
+    <ds:schemaRef ds:uri="http://schemas.microsoft.com/office/2006/metadata/properties/metaAttributes"/>
+    <ds:schemaRef ds:uri="http://www.w3.org/2001/XMLSchema"/>
+    <ds:schemaRef ds:uri="http://schemas.microsoft.com/office/2006/metadata/properties"/>
+    <ds:schemaRef ds:uri="164883f8-7691-4ecf-b54a-664c0d0edefe"/>
+    <ds:schemaRef ds:uri="85e30bcc-d76c-4413-8e4d-2dce22fb0743"/>
+    <ds:schemaRef ds:uri="http://schemas.microsoft.com/office/2006/documentManagement/types"/>
+    <ds:schemaRef ds:uri="http://schemas.microsoft.com/office/infopath/2007/PartnerControls"/>
+    <ds:schemaRef ds:uri="http://schemas.openxmlformats.org/package/2006/metadata/core-properties"/>
+    <ds:schemaRef ds:uri="http://purl.org/dc/elements/1.1/"/>
+    <ds:schemaRef ds:uri="http://purl.org/dc/terms/"/>
+    <ds:schemaRef ds:uri="http://schemas.microsoft.com/internal/obd"/>
   </ds:schemaRefs>
 </ds:datastoreItem>
 </file>
@@ -2807,20 +3436,9 @@
 </file>
 
 <file path=customXml/itemProps3.xml><?xml version="1.0" encoding="utf-8"?>
-<ds:datastoreItem xmlns:ds="http://schemas.openxmlformats.org/officeDocument/2006/customXml" ds:itemID="{84308E8E-45E8-4576-AFDB-330AF0432F54}">
+<ds:datastoreItem xmlns:ds="http://schemas.openxmlformats.org/officeDocument/2006/customXml" ds:itemID="{1F59EA8B-1FA8-40D2-A8B0-61B9CE1E4579}">
   <ds:schemaRefs>
-    <ds:schemaRef ds:uri="http://schemas.microsoft.com/office/2006/metadata/contentType"/>
-    <ds:schemaRef ds:uri="http://schemas.microsoft.com/office/2006/metadata/properties/metaAttributes"/>
-    <ds:schemaRef ds:uri="http://www.w3.org/2001/XMLSchema"/>
-    <ds:schemaRef ds:uri="http://schemas.microsoft.com/office/2006/metadata/properties"/>
-    <ds:schemaRef ds:uri="164883f8-7691-4ecf-b54a-664c0d0edefe"/>
-    <ds:schemaRef ds:uri="85e30bcc-d76c-4413-8e4d-2dce22fb0743"/>
-    <ds:schemaRef ds:uri="http://schemas.microsoft.com/office/2006/documentManagement/types"/>
-    <ds:schemaRef ds:uri="http://schemas.microsoft.com/office/infopath/2007/PartnerControls"/>
-    <ds:schemaRef ds:uri="http://schemas.openxmlformats.org/package/2006/metadata/core-properties"/>
-    <ds:schemaRef ds:uri="http://purl.org/dc/elements/1.1/"/>
-    <ds:schemaRef ds:uri="http://purl.org/dc/terms/"/>
-    <ds:schemaRef ds:uri="http://schemas.microsoft.com/internal/obd"/>
+    <ds:schemaRef ds:uri="http://schemas.microsoft.com/sharepoint/v3/contenttype/forms"/>
   </ds:schemaRefs>
 </ds:datastoreItem>
 </file>
</xml_diff>